<commit_message>
docs: perfect 7-page front matter with no page numbers, authentic logbook match and clean A4 compilation
</commit_message>
<xml_diff>
--- a/docs/chapters/AI-Rescue_Chapters_1_to_4_A4.docx
+++ b/docs/chapters/AI-Rescue_Chapters_1_to_4_A4.docx
@@ -25348,7 +25348,7 @@
     </w:lvl>
   </w:abstractNum>
   <w:abstractNum w:abstractNumId="4" w15:restartNumberingAfterBreak="0">
-    <w:nsid w:val="05745A7D"/>
+    <w:nsid w:val="03049420"/>
     <w:multiLevelType w:val="multilevel"/>
     <w:tmpl w:val="8F703BE0"/>
     <w:lvl w:ilvl="0">
@@ -25497,7 +25497,7 @@
     </w:lvl>
   </w:abstractNum>
   <w:abstractNum w:abstractNumId="5" w15:restartNumberingAfterBreak="0">
-    <w:nsid w:val="03C79E41"/>
+    <w:nsid w:val="04FC9CA3"/>
     <w:multiLevelType w:val="multilevel"/>
     <w:tmpl w:val="1ED2D07E"/>
     <w:lvl w:ilvl="0">
@@ -25646,7 +25646,7 @@
     </w:lvl>
   </w:abstractNum>
   <w:abstractNum w:abstractNumId="6" w15:restartNumberingAfterBreak="0">
-    <w:nsid w:val="058F1C8C"/>
+    <w:nsid w:val="01F5A0BC"/>
     <w:multiLevelType w:val="multilevel"/>
     <w:tmpl w:val="56BAB812"/>
     <w:lvl w:ilvl="0">
@@ -25795,7 +25795,7 @@
     </w:lvl>
   </w:abstractNum>
   <w:abstractNum w:abstractNumId="7" w15:restartNumberingAfterBreak="0">
-    <w:nsid w:val="04B1A339"/>
+    <w:nsid w:val="02EE0866"/>
     <w:multiLevelType w:val="multilevel"/>
     <w:tmpl w:val="14F09716"/>
     <w:lvl w:ilvl="0">
@@ -25944,7 +25944,7 @@
     </w:lvl>
   </w:abstractNum>
   <w:abstractNum w:abstractNumId="8" w15:restartNumberingAfterBreak="0">
-    <w:nsid w:val="021F1052"/>
+    <w:nsid w:val="0223A100"/>
     <w:multiLevelType w:val="multilevel"/>
     <w:tmpl w:val="25E05E0C"/>
     <w:lvl w:ilvl="0">
@@ -26093,7 +26093,7 @@
     </w:lvl>
   </w:abstractNum>
   <w:abstractNum w:abstractNumId="9" w15:restartNumberingAfterBreak="0">
-    <w:nsid w:val="01C7EB6D"/>
+    <w:nsid w:val="0478486C"/>
     <w:multiLevelType w:val="multilevel"/>
     <w:tmpl w:val="EBC20560"/>
     <w:lvl w:ilvl="0">
@@ -26242,7 +26242,7 @@
     </w:lvl>
   </w:abstractNum>
   <w:abstractNum w:abstractNumId="10" w15:restartNumberingAfterBreak="0">
-    <w:nsid w:val="04D8428C"/>
+    <w:nsid w:val="02A22DED"/>
     <w:multiLevelType w:val="multilevel"/>
     <w:tmpl w:val="1F789084"/>
     <w:lvl w:ilvl="0">
@@ -26355,7 +26355,7 @@
     </w:lvl>
   </w:abstractNum>
   <w:abstractNum w:abstractNumId="11" w15:restartNumberingAfterBreak="0">
-    <w:nsid w:val="028824F7"/>
+    <w:nsid w:val="04D997C9"/>
     <w:multiLevelType w:val="multilevel"/>
     <w:tmpl w:val="4FC23966"/>
     <w:lvl w:ilvl="0">
@@ -26504,7 +26504,7 @@
     </w:lvl>
   </w:abstractNum>
   <w:abstractNum w:abstractNumId="12" w15:restartNumberingAfterBreak="0">
-    <w:nsid w:val="0438A782"/>
+    <w:nsid w:val="013EFD38"/>
     <w:multiLevelType w:val="multilevel"/>
     <w:tmpl w:val="0246A34E"/>
     <w:lvl w:ilvl="0">
@@ -26653,7 +26653,7 @@
     </w:lvl>
   </w:abstractNum>
   <w:abstractNum w:abstractNumId="13" w15:restartNumberingAfterBreak="0">
-    <w:nsid w:val="03DB6014"/>
+    <w:nsid w:val="0570E57A"/>
     <w:multiLevelType w:val="multilevel"/>
     <w:tmpl w:val="6A4C872A"/>
     <w:lvl w:ilvl="0">
@@ -26802,7 +26802,7 @@
     </w:lvl>
   </w:abstractNum>
   <w:abstractNum w:abstractNumId="14" w15:restartNumberingAfterBreak="0">
-    <w:nsid w:val="03AFE4CF"/>
+    <w:nsid w:val="0590A2E7"/>
     <w:multiLevelType w:val="multilevel"/>
     <w:tmpl w:val="C530572A"/>
     <w:lvl w:ilvl="0">
@@ -26951,7 +26951,7 @@
     </w:lvl>
   </w:abstractNum>
   <w:abstractNum w:abstractNumId="15" w15:restartNumberingAfterBreak="0">
-    <w:nsid w:val="00F64774"/>
+    <w:nsid w:val="05D5553F"/>
     <w:multiLevelType w:val="multilevel"/>
     <w:tmpl w:val="EF52C5E0"/>
     <w:lvl w:ilvl="0">
@@ -27100,7 +27100,7 @@
     </w:lvl>
   </w:abstractNum>
   <w:abstractNum w:abstractNumId="16" w15:restartNumberingAfterBreak="0">
-    <w:nsid w:val="00716E20"/>
+    <w:nsid w:val="02B28EDE"/>
     <w:multiLevelType w:val="multilevel"/>
     <w:tmpl w:val="EBD01504"/>
     <w:lvl w:ilvl="0">
@@ -27249,7 +27249,7 @@
     </w:lvl>
   </w:abstractNum>
   <w:abstractNum w:abstractNumId="17" w15:restartNumberingAfterBreak="0">
-    <w:nsid w:val="0315CCC2"/>
+    <w:nsid w:val="055BE85C"/>
     <w:multiLevelType w:val="multilevel"/>
     <w:tmpl w:val="D12AF8AC"/>
     <w:lvl w:ilvl="0">
@@ -27398,7 +27398,7 @@
     </w:lvl>
   </w:abstractNum>
   <w:abstractNum w:abstractNumId="18" w15:restartNumberingAfterBreak="0">
-    <w:nsid w:val="05453C6D"/>
+    <w:nsid w:val="04A5F580"/>
     <w:multiLevelType w:val="multilevel"/>
     <w:tmpl w:val="6B12E9B6"/>
     <w:lvl w:ilvl="0">
@@ -27547,7 +27547,7 @@
     </w:lvl>
   </w:abstractNum>
   <w:abstractNum w:abstractNumId="19" w15:restartNumberingAfterBreak="0">
-    <w:nsid w:val="030A9674"/>
+    <w:nsid w:val="0251212D"/>
     <w:multiLevelType w:val="multilevel"/>
     <w:tmpl w:val="5432618E"/>
     <w:lvl w:ilvl="0">
@@ -27696,7 +27696,7 @@
     </w:lvl>
   </w:abstractNum>
   <w:abstractNum w:abstractNumId="20" w15:restartNumberingAfterBreak="0">
-    <w:nsid w:val="0349955D"/>
+    <w:nsid w:val="01211340"/>
     <w:multiLevelType w:val="multilevel"/>
     <w:tmpl w:val="03B0F108"/>
     <w:lvl w:ilvl="0">
@@ -27845,7 +27845,7 @@
     </w:lvl>
   </w:abstractNum>
   <w:abstractNum w:abstractNumId="21" w15:restartNumberingAfterBreak="0">
-    <w:nsid w:val="01860535"/>
+    <w:nsid w:val="00ABA917"/>
     <w:multiLevelType w:val="multilevel"/>
     <w:tmpl w:val="E124E6EC"/>
     <w:lvl w:ilvl="0">
@@ -27994,7 +27994,7 @@
     </w:lvl>
   </w:abstractNum>
   <w:abstractNum w:abstractNumId="22" w15:restartNumberingAfterBreak="0">
-    <w:nsid w:val="013E66A8"/>
+    <w:nsid w:val="03E05E6E"/>
     <w:multiLevelType w:val="multilevel"/>
     <w:tmpl w:val="A7B68B0A"/>
     <w:lvl w:ilvl="0">
@@ -28107,7 +28107,7 @@
     </w:lvl>
   </w:abstractNum>
   <w:abstractNum w:abstractNumId="23" w15:restartNumberingAfterBreak="0">
-    <w:nsid w:val="002E1AB8"/>
+    <w:nsid w:val="058FC64A"/>
     <w:multiLevelType w:val="hybridMultilevel"/>
     <w:tmpl w:val="785E38F0"/>
     <w:lvl w:ilvl="0" w:tplc="4009000F">
@@ -28196,7 +28196,7 @@
     </w:lvl>
   </w:abstractNum>
   <w:abstractNum w:abstractNumId="24" w15:restartNumberingAfterBreak="0">
-    <w:nsid w:val="0213D01E"/>
+    <w:nsid w:val="049E85CC"/>
     <w:multiLevelType w:val="multilevel"/>
     <w:tmpl w:val="AA3AE844"/>
     <w:lvl w:ilvl="0">
@@ -28345,7 +28345,7 @@
     </w:lvl>
   </w:abstractNum>
   <w:abstractNum w:abstractNumId="25" w15:restartNumberingAfterBreak="0">
-    <w:nsid w:val="02AAED87"/>
+    <w:nsid w:val="04F8DFD9"/>
     <w:multiLevelType w:val="multilevel"/>
     <w:tmpl w:val="9154D8D0"/>
     <w:lvl w:ilvl="0">
@@ -28494,7 +28494,7 @@
     </w:lvl>
   </w:abstractNum>
   <w:abstractNum w:abstractNumId="26" w15:restartNumberingAfterBreak="0">
-    <w:nsid w:val="0046372B"/>
+    <w:nsid w:val="00353EC8"/>
     <w:multiLevelType w:val="multilevel"/>
     <w:tmpl w:val="CC9898F4"/>
     <w:lvl w:ilvl="0">
@@ -28643,7 +28643,7 @@
     </w:lvl>
   </w:abstractNum>
   <w:abstractNum w:abstractNumId="27" w15:restartNumberingAfterBreak="0">
-    <w:nsid w:val="05A2A0E5"/>
+    <w:nsid w:val="04DB9859"/>
     <w:multiLevelType w:val="multilevel"/>
     <w:tmpl w:val="5E3C9B54"/>
     <w:lvl w:ilvl="0">
@@ -28792,7 +28792,7 @@
     </w:lvl>
   </w:abstractNum>
   <w:abstractNum w:abstractNumId="28" w15:restartNumberingAfterBreak="0">
-    <w:nsid w:val="02C4D292"/>
+    <w:nsid w:val="02D65DA2"/>
     <w:multiLevelType w:val="multilevel"/>
     <w:tmpl w:val="04B2A070"/>
     <w:lvl w:ilvl="0">
@@ -28941,7 +28941,7 @@
     </w:lvl>
   </w:abstractNum>
   <w:abstractNum w:abstractNumId="29" w15:restartNumberingAfterBreak="0">
-    <w:nsid w:val="03CD88AE"/>
+    <w:nsid w:val="032433F9"/>
     <w:multiLevelType w:val="multilevel"/>
     <w:tmpl w:val="17AA17F2"/>
     <w:lvl w:ilvl="0">
@@ -29090,7 +29090,7 @@
     </w:lvl>
   </w:abstractNum>
   <w:abstractNum w:abstractNumId="30" w15:restartNumberingAfterBreak="0">
-    <w:nsid w:val="016CDAA6"/>
+    <w:nsid w:val="040CBA53"/>
     <w:multiLevelType w:val="multilevel"/>
     <w:tmpl w:val="5C6053B0"/>
     <w:lvl w:ilvl="0">
@@ -29239,7 +29239,7 @@
     </w:lvl>
   </w:abstractNum>
   <w:abstractNum w:abstractNumId="31" w15:restartNumberingAfterBreak="0">
-    <w:nsid w:val="056C8BB1"/>
+    <w:nsid w:val="011DDD85"/>
     <w:multiLevelType w:val="multilevel"/>
     <w:tmpl w:val="E3D4D136"/>
     <w:lvl w:ilvl="0">
@@ -29388,7 +29388,7 @@
     </w:lvl>
   </w:abstractNum>
   <w:abstractNum w:abstractNumId="32" w15:restartNumberingAfterBreak="0">
-    <w:nsid w:val="00BBA072"/>
+    <w:nsid w:val="0182C423"/>
     <w:multiLevelType w:val="multilevel"/>
     <w:tmpl w:val="3F121F5A"/>
     <w:lvl w:ilvl="0">
@@ -29537,7 +29537,7 @@
     </w:lvl>
   </w:abstractNum>
   <w:abstractNum w:abstractNumId="33" w15:restartNumberingAfterBreak="0">
-    <w:nsid w:val="01157FB3"/>
+    <w:nsid w:val="013497F2"/>
     <w:multiLevelType w:val="multilevel"/>
     <w:tmpl w:val="ACBC1308"/>
     <w:lvl w:ilvl="0">
@@ -29686,7 +29686,7 @@
     </w:lvl>
   </w:abstractNum>
   <w:abstractNum w:abstractNumId="34" w15:restartNumberingAfterBreak="0">
-    <w:nsid w:val="032A70B3"/>
+    <w:nsid w:val="0344FB86"/>
     <w:multiLevelType w:val="multilevel"/>
     <w:tmpl w:val="E524479C"/>
     <w:lvl w:ilvl="0">
@@ -29835,7 +29835,7 @@
     </w:lvl>
   </w:abstractNum>
   <w:abstractNum w:abstractNumId="35" w15:restartNumberingAfterBreak="0">
-    <w:nsid w:val="05D279D8"/>
+    <w:nsid w:val="05C993FD"/>
     <w:multiLevelType w:val="multilevel"/>
     <w:tmpl w:val="395CCD4C"/>
     <w:lvl w:ilvl="0">
@@ -29984,7 +29984,7 @@
     </w:lvl>
   </w:abstractNum>
   <w:abstractNum w:abstractNumId="36" w15:restartNumberingAfterBreak="0">
-    <w:nsid w:val="00C83E3C"/>
+    <w:nsid w:val="0078F9B6"/>
     <w:multiLevelType w:val="multilevel"/>
     <w:tmpl w:val="68A03BB4"/>
     <w:lvl w:ilvl="0">
@@ -30133,7 +30133,7 @@
     </w:lvl>
   </w:abstractNum>
   <w:abstractNum w:abstractNumId="37" w15:restartNumberingAfterBreak="0">
-    <w:nsid w:val="032C2CC1"/>
+    <w:nsid w:val="0064127B"/>
     <w:multiLevelType w:val="multilevel"/>
     <w:tmpl w:val="01C4354C"/>
     <w:lvl w:ilvl="0">
@@ -30282,7 +30282,7 @@
     </w:lvl>
   </w:abstractNum>
   <w:abstractNum w:abstractNumId="38" w15:restartNumberingAfterBreak="0">
-    <w:nsid w:val="0292411A"/>
+    <w:nsid w:val="01720DEC"/>
     <w:multiLevelType w:val="multilevel"/>
     <w:tmpl w:val="3AD69EF2"/>
     <w:lvl w:ilvl="0">
@@ -30431,7 +30431,7 @@
     </w:lvl>
   </w:abstractNum>
   <w:abstractNum w:abstractNumId="39" w15:restartNumberingAfterBreak="0">
-    <w:nsid w:val="03C44B75"/>
+    <w:nsid w:val="001D0685"/>
     <w:multiLevelType w:val="multilevel"/>
     <w:tmpl w:val="2E04D86E"/>
     <w:lvl w:ilvl="0">
@@ -30580,7 +30580,7 @@
     </w:lvl>
   </w:abstractNum>
   <w:abstractNum w:abstractNumId="40" w15:restartNumberingAfterBreak="0">
-    <w:nsid w:val="0144889F"/>
+    <w:nsid w:val="03E8DF40"/>
     <w:multiLevelType w:val="multilevel"/>
     <w:tmpl w:val="6B645864"/>
     <w:lvl w:ilvl="0">
@@ -30729,7 +30729,7 @@
     </w:lvl>
   </w:abstractNum>
   <w:abstractNum w:abstractNumId="41" w15:restartNumberingAfterBreak="0">
-    <w:nsid w:val="040CE5D5"/>
+    <w:nsid w:val="02FBC88F"/>
     <w:multiLevelType w:val="multilevel"/>
     <w:tmpl w:val="F25EAEE0"/>
     <w:lvl w:ilvl="0">
@@ -30878,7 +30878,7 @@
     </w:lvl>
   </w:abstractNum>
   <w:abstractNum w:abstractNumId="42" w15:restartNumberingAfterBreak="0">
-    <w:nsid w:val="013B1AD4"/>
+    <w:nsid w:val="03908104"/>
     <w:multiLevelType w:val="multilevel"/>
     <w:tmpl w:val="7646E6DA"/>
     <w:lvl w:ilvl="0">
@@ -31027,7 +31027,7 @@
     </w:lvl>
   </w:abstractNum>
   <w:abstractNum w:abstractNumId="43" w15:restartNumberingAfterBreak="0">
-    <w:nsid w:val="0503D671"/>
+    <w:nsid w:val="02FAFD0F"/>
     <w:multiLevelType w:val="multilevel"/>
     <w:tmpl w:val="EC0C2D7A"/>
     <w:lvl w:ilvl="0">
@@ -31140,7 +31140,7 @@
     </w:lvl>
   </w:abstractNum>
   <w:abstractNum w:abstractNumId="44" w15:restartNumberingAfterBreak="0">
-    <w:nsid w:val="0520458D"/>
+    <w:nsid w:val="05C34988"/>
     <w:multiLevelType w:val="multilevel"/>
     <w:tmpl w:val="AC44280E"/>
     <w:lvl w:ilvl="0">
@@ -31289,7 +31289,7 @@
     </w:lvl>
   </w:abstractNum>
   <w:abstractNum w:abstractNumId="45" w15:restartNumberingAfterBreak="0">
-    <w:nsid w:val="022BCA20"/>
+    <w:nsid w:val="00DC32D6"/>
     <w:multiLevelType w:val="multilevel"/>
     <w:tmpl w:val="A3F4486E"/>
     <w:lvl w:ilvl="0">
@@ -31438,7 +31438,7 @@
     </w:lvl>
   </w:abstractNum>
   <w:abstractNum w:abstractNumId="46" w15:restartNumberingAfterBreak="0">
-    <w:nsid w:val="05018032"/>
+    <w:nsid w:val="048A93E3"/>
     <w:multiLevelType w:val="multilevel"/>
     <w:tmpl w:val="21A04972"/>
     <w:lvl w:ilvl="0">
@@ -31587,7 +31587,7 @@
     </w:lvl>
   </w:abstractNum>
   <w:abstractNum w:abstractNumId="47" w15:restartNumberingAfterBreak="0">
-    <w:nsid w:val="03CC17B0"/>
+    <w:nsid w:val="03645A78"/>
     <w:multiLevelType w:val="multilevel"/>
     <w:tmpl w:val="C28019D8"/>
     <w:lvl w:ilvl="0">
@@ -31736,7 +31736,7 @@
     </w:lvl>
   </w:abstractNum>
   <w:abstractNum w:abstractNumId="48" w15:restartNumberingAfterBreak="0">
-    <w:nsid w:val="04166F4B"/>
+    <w:nsid w:val="002DFACC"/>
     <w:multiLevelType w:val="multilevel"/>
     <w:tmpl w:val="64E2A65E"/>
     <w:lvl w:ilvl="0">

</xml_diff>